<commit_message>
Actualizacion de casos de prueba
</commit_message>
<xml_diff>
--- a/01 Documentación/Scrum/EcoWaste_Historias de Usuario.docx
+++ b/01 Documentación/Scrum/EcoWaste_Historias de Usuario.docx
@@ -143,29 +143,7 @@
                 <w:sz w:val="22"/>
                 <w:szCs w:val="22"/>
               </w:rPr>
-              <w:t>HU000</w:t>
-            </w:r>
-            <w:r>
-              <w:rPr>
-                <w:rFonts w:ascii="Calibri" w:eastAsia="Calibri" w:hAnsi="Calibri" w:cs="Calibri"/>
-                <w:b/>
-                <w:bCs/>
-                <w:color w:val="FFFFFF"/>
-                <w:sz w:val="22"/>
-                <w:szCs w:val="22"/>
-              </w:rPr>
-              <w:t>1</w:t>
-            </w:r>
-            <w:r>
-              <w:rPr>
-                <w:rFonts w:ascii="Calibri" w:eastAsia="Calibri" w:hAnsi="Calibri" w:cs="Calibri"/>
-                <w:b/>
-                <w:bCs/>
-                <w:color w:val="FFFFFF"/>
-                <w:sz w:val="22"/>
-                <w:szCs w:val="22"/>
-              </w:rPr>
-              <w:t xml:space="preserve"> Crear nueva publicación</w:t>
+              <w:t>HU0001 Crear nueva publicación</w:t>
             </w:r>
           </w:p>
         </w:tc>
@@ -293,29 +271,7 @@
                 <w:sz w:val="22"/>
                 <w:szCs w:val="22"/>
               </w:rPr>
-              <w:t xml:space="preserve"> </w:t>
-            </w:r>
-            <w:r>
-              <w:rPr>
-                <w:rFonts w:ascii="Calibri" w:eastAsia="Calibri" w:hAnsi="Calibri" w:cs="Calibri"/>
-                <w:b/>
-                <w:bCs/>
-                <w:color w:val="FFFFFF"/>
-                <w:sz w:val="22"/>
-                <w:szCs w:val="22"/>
-              </w:rPr>
-              <w:t>h</w:t>
-            </w:r>
-            <w:r>
-              <w:rPr>
-                <w:rFonts w:ascii="Calibri" w:eastAsia="Calibri" w:hAnsi="Calibri" w:cs="Calibri"/>
-                <w:b/>
-                <w:bCs/>
-                <w:color w:val="FFFFFF"/>
-                <w:sz w:val="22"/>
-                <w:szCs w:val="22"/>
-              </w:rPr>
-              <w:t>oras</w:t>
+              <w:t xml:space="preserve"> horas</w:t>
             </w:r>
           </w:p>
         </w:tc>
@@ -707,40 +663,7 @@
                 <w:sz w:val="22"/>
                 <w:szCs w:val="22"/>
               </w:rPr>
-              <w:t>HU000</w:t>
-            </w:r>
-            <w:r>
-              <w:rPr>
-                <w:rFonts w:ascii="Calibri" w:eastAsia="Calibri" w:hAnsi="Calibri" w:cs="Calibri"/>
-                <w:b/>
-                <w:bCs/>
-                <w:color w:val="FFFFFF"/>
-                <w:sz w:val="22"/>
-                <w:szCs w:val="22"/>
-              </w:rPr>
-              <w:t>2</w:t>
-            </w:r>
-            <w:r>
-              <w:rPr>
-                <w:rFonts w:ascii="Calibri" w:eastAsia="Calibri" w:hAnsi="Calibri" w:cs="Calibri"/>
-                <w:b/>
-                <w:bCs/>
-                <w:color w:val="FFFFFF"/>
-                <w:sz w:val="22"/>
-                <w:szCs w:val="22"/>
-              </w:rPr>
-              <w:t xml:space="preserve"> </w:t>
-            </w:r>
-            <w:r>
-              <w:rPr>
-                <w:rFonts w:ascii="Calibri" w:eastAsia="Calibri" w:hAnsi="Calibri" w:cs="Calibri"/>
-                <w:b/>
-                <w:bCs/>
-                <w:color w:val="FFFFFF"/>
-                <w:sz w:val="22"/>
-                <w:szCs w:val="22"/>
-              </w:rPr>
-              <w:t>Listar mis publicaciones</w:t>
+              <w:t>HU0002 Listar mis publicaciones</w:t>
             </w:r>
           </w:p>
         </w:tc>
@@ -909,39 +832,7 @@
                 <w:sz w:val="22"/>
                 <w:szCs w:val="22"/>
               </w:rPr>
-              <w:t xml:space="preserve"> </w:t>
-            </w:r>
-            <w:r>
-              <w:rPr>
-                <w:rFonts w:ascii="Calibri" w:eastAsia="Calibri" w:hAnsi="Calibri" w:cs="Calibri"/>
-                <w:sz w:val="22"/>
-                <w:szCs w:val="22"/>
-              </w:rPr>
-              <w:t>Listar</w:t>
-            </w:r>
-            <w:r>
-              <w:rPr>
-                <w:rFonts w:ascii="Calibri" w:eastAsia="Calibri" w:hAnsi="Calibri" w:cs="Calibri"/>
-                <w:sz w:val="22"/>
-                <w:szCs w:val="22"/>
-              </w:rPr>
-              <w:t xml:space="preserve"> </w:t>
-            </w:r>
-            <w:r>
-              <w:rPr>
-                <w:rFonts w:ascii="Calibri" w:eastAsia="Calibri" w:hAnsi="Calibri" w:cs="Calibri"/>
-                <w:sz w:val="22"/>
-                <w:szCs w:val="22"/>
-              </w:rPr>
-              <w:t xml:space="preserve">mis </w:t>
-            </w:r>
-            <w:r>
-              <w:rPr>
-                <w:rFonts w:ascii="Calibri" w:eastAsia="Calibri" w:hAnsi="Calibri" w:cs="Calibri"/>
-                <w:sz w:val="22"/>
-                <w:szCs w:val="22"/>
-              </w:rPr>
-              <w:t>publicación</w:t>
+              <w:t xml:space="preserve"> Listar mis publicación</w:t>
             </w:r>
           </w:p>
         </w:tc>
@@ -997,6 +888,9 @@
               <w:jc w:val="center"/>
             </w:pPr>
             <w:r>
+              <w:rPr>
+                <w:noProof/>
+              </w:rPr>
               <w:lastRenderedPageBreak/>
               <w:drawing>
                 <wp:inline distT="0" distB="0" distL="0" distR="0" wp14:anchorId="0EBB92F6" wp14:editId="4D019F9A">
@@ -1040,6 +934,9 @@
               <w:jc w:val="center"/>
             </w:pPr>
             <w:r>
+              <w:rPr>
+                <w:noProof/>
+              </w:rPr>
               <w:drawing>
                 <wp:inline distT="0" distB="0" distL="0" distR="0" wp14:anchorId="02D44FBA" wp14:editId="26034C58">
                   <wp:extent cx="6599492" cy="4282811"/>
@@ -1332,29 +1229,7 @@
                 <w:sz w:val="22"/>
                 <w:szCs w:val="22"/>
               </w:rPr>
-              <w:t>HU000</w:t>
-            </w:r>
-            <w:r>
-              <w:rPr>
-                <w:rFonts w:ascii="Calibri" w:eastAsia="Calibri" w:hAnsi="Calibri" w:cs="Calibri"/>
-                <w:b/>
-                <w:bCs/>
-                <w:color w:val="FFFFFF"/>
-                <w:sz w:val="22"/>
-                <w:szCs w:val="22"/>
-              </w:rPr>
-              <w:t>3 Editar</w:t>
-            </w:r>
-            <w:r>
-              <w:rPr>
-                <w:rFonts w:ascii="Calibri" w:eastAsia="Calibri" w:hAnsi="Calibri" w:cs="Calibri"/>
-                <w:b/>
-                <w:bCs/>
-                <w:color w:val="FFFFFF"/>
-                <w:sz w:val="22"/>
-                <w:szCs w:val="22"/>
-              </w:rPr>
-              <w:t xml:space="preserve"> mis publicaciones</w:t>
+              <w:t>HU0003 Editar mis publicaciones</w:t>
             </w:r>
           </w:p>
         </w:tc>
@@ -1523,23 +1398,7 @@
                 <w:sz w:val="22"/>
                 <w:szCs w:val="22"/>
               </w:rPr>
-              <w:t xml:space="preserve"> </w:t>
-            </w:r>
-            <w:r>
-              <w:rPr>
-                <w:rFonts w:ascii="Calibri" w:eastAsia="Calibri" w:hAnsi="Calibri" w:cs="Calibri"/>
-                <w:sz w:val="22"/>
-                <w:szCs w:val="22"/>
-              </w:rPr>
-              <w:t>Editar</w:t>
-            </w:r>
-            <w:r>
-              <w:rPr>
-                <w:rFonts w:ascii="Calibri" w:eastAsia="Calibri" w:hAnsi="Calibri" w:cs="Calibri"/>
-                <w:sz w:val="22"/>
-                <w:szCs w:val="22"/>
-              </w:rPr>
-              <w:t xml:space="preserve"> mis publicación</w:t>
+              <w:t xml:space="preserve"> Editar mis publicación</w:t>
             </w:r>
           </w:p>
         </w:tc>
@@ -1603,6 +1462,9 @@
               <w:jc w:val="center"/>
             </w:pPr>
             <w:r>
+              <w:rPr>
+                <w:noProof/>
+              </w:rPr>
               <w:drawing>
                 <wp:inline distT="0" distB="0" distL="0" distR="0" wp14:anchorId="6D39E436" wp14:editId="60F4D38B">
                   <wp:extent cx="6637595" cy="4320914"/>
@@ -1645,6 +1507,9 @@
               <w:jc w:val="center"/>
             </w:pPr>
             <w:r>
+              <w:rPr>
+                <w:noProof/>
+              </w:rPr>
               <w:lastRenderedPageBreak/>
               <w:drawing>
                 <wp:inline distT="0" distB="0" distL="0" distR="0" wp14:anchorId="47453146" wp14:editId="448036B3">
@@ -1848,7 +1713,7 @@
       </w:tblGrid>
       <w:tr>
         <w:trPr>
-          <w:trHeight w:hRule="exact" w:val="440"/>
+          <w:trHeight w:hRule="exact" w:val="1087"/>
         </w:trPr>
         <w:tc>
           <w:tcPr>
@@ -1910,51 +1775,7 @@
                 <w:sz w:val="22"/>
                 <w:szCs w:val="22"/>
               </w:rPr>
-              <w:t>HU000</w:t>
-            </w:r>
-            <w:r>
-              <w:rPr>
-                <w:rFonts w:ascii="Calibri" w:eastAsia="Calibri" w:hAnsi="Calibri" w:cs="Calibri"/>
-                <w:b/>
-                <w:bCs/>
-                <w:color w:val="FFFFFF"/>
-                <w:sz w:val="22"/>
-                <w:szCs w:val="22"/>
-              </w:rPr>
-              <w:t>4</w:t>
-            </w:r>
-            <w:r>
-              <w:rPr>
-                <w:rFonts w:ascii="Calibri" w:eastAsia="Calibri" w:hAnsi="Calibri" w:cs="Calibri"/>
-                <w:b/>
-                <w:bCs/>
-                <w:color w:val="FFFFFF"/>
-                <w:sz w:val="22"/>
-                <w:szCs w:val="22"/>
-              </w:rPr>
-              <w:t xml:space="preserve"> E</w:t>
-            </w:r>
-            <w:r>
-              <w:rPr>
-                <w:rFonts w:ascii="Calibri" w:eastAsia="Calibri" w:hAnsi="Calibri" w:cs="Calibri"/>
-                <w:b/>
-                <w:bCs/>
-                <w:color w:val="FFFFFF"/>
-                <w:sz w:val="22"/>
-                <w:szCs w:val="22"/>
-              </w:rPr>
-              <w:t>liminar</w:t>
-            </w:r>
-            <w:r>
-              <w:rPr>
-                <w:rFonts w:ascii="Calibri" w:eastAsia="Calibri" w:hAnsi="Calibri" w:cs="Calibri"/>
-                <w:b/>
-                <w:bCs/>
-                <w:color w:val="FFFFFF"/>
-                <w:sz w:val="22"/>
-                <w:szCs w:val="22"/>
-              </w:rPr>
-              <w:t xml:space="preserve"> mis publicaciones</w:t>
+              <w:t>HU0004 Eliminar mis publicaciones</w:t>
             </w:r>
           </w:p>
         </w:tc>
@@ -2123,23 +1944,7 @@
                 <w:sz w:val="22"/>
                 <w:szCs w:val="22"/>
               </w:rPr>
-              <w:t xml:space="preserve"> E</w:t>
-            </w:r>
-            <w:r>
-              <w:rPr>
-                <w:rFonts w:ascii="Calibri" w:eastAsia="Calibri" w:hAnsi="Calibri" w:cs="Calibri"/>
-                <w:sz w:val="22"/>
-                <w:szCs w:val="22"/>
-              </w:rPr>
-              <w:t>liminar</w:t>
-            </w:r>
-            <w:r>
-              <w:rPr>
-                <w:rFonts w:ascii="Calibri" w:eastAsia="Calibri" w:hAnsi="Calibri" w:cs="Calibri"/>
-                <w:sz w:val="22"/>
-                <w:szCs w:val="22"/>
-              </w:rPr>
-              <w:t xml:space="preserve"> mis publicación</w:t>
+              <w:t xml:space="preserve"> Eliminar mis publicación</w:t>
             </w:r>
           </w:p>
         </w:tc>
@@ -2299,6 +2104,9 @@
               </mc:AlternateContent>
             </w:r>
             <w:r>
+              <w:rPr>
+                <w:noProof/>
+              </w:rPr>
               <w:drawing>
                 <wp:inline distT="0" distB="0" distL="0" distR="0" wp14:anchorId="73B48E3E" wp14:editId="51BB61A3">
                   <wp:extent cx="6645910" cy="4187190"/>
@@ -2341,6 +2149,9 @@
               <w:jc w:val="center"/>
             </w:pPr>
             <w:r>
+              <w:rPr>
+                <w:noProof/>
+              </w:rPr>
               <w:drawing>
                 <wp:inline distT="0" distB="0" distL="0" distR="0" wp14:anchorId="5106ED20" wp14:editId="11C3D073">
                   <wp:extent cx="4092295" cy="1066892"/>
@@ -2613,29 +2424,7 @@
                 <w:sz w:val="22"/>
                 <w:szCs w:val="22"/>
               </w:rPr>
-              <w:t>HU000</w:t>
-            </w:r>
-            <w:r>
-              <w:rPr>
-                <w:rFonts w:ascii="Calibri" w:eastAsia="Calibri" w:hAnsi="Calibri" w:cs="Calibri"/>
-                <w:b/>
-                <w:bCs/>
-                <w:color w:val="FFFFFF"/>
-                <w:sz w:val="22"/>
-                <w:szCs w:val="22"/>
-              </w:rPr>
-              <w:t>5</w:t>
-            </w:r>
-            <w:r>
-              <w:rPr>
-                <w:rFonts w:ascii="Calibri" w:eastAsia="Calibri" w:hAnsi="Calibri" w:cs="Calibri"/>
-                <w:b/>
-                <w:bCs/>
-                <w:color w:val="FFFFFF"/>
-                <w:sz w:val="22"/>
-                <w:szCs w:val="22"/>
-              </w:rPr>
-              <w:t xml:space="preserve"> </w:t>
+              <w:t xml:space="preserve">HU0005 </w:t>
             </w:r>
             <w:r>
               <w:rPr>
@@ -2815,31 +2604,7 @@
                 <w:sz w:val="22"/>
                 <w:szCs w:val="22"/>
               </w:rPr>
-              <w:t xml:space="preserve"> </w:t>
-            </w:r>
-            <w:r>
-              <w:rPr>
-                <w:rFonts w:ascii="Calibri" w:eastAsia="Calibri" w:hAnsi="Calibri" w:cs="Calibri"/>
-                <w:sz w:val="22"/>
-                <w:szCs w:val="22"/>
-              </w:rPr>
-              <w:t>Listar las</w:t>
-            </w:r>
-            <w:r>
-              <w:rPr>
-                <w:rFonts w:ascii="Calibri" w:eastAsia="Calibri" w:hAnsi="Calibri" w:cs="Calibri"/>
-                <w:sz w:val="22"/>
-                <w:szCs w:val="22"/>
-              </w:rPr>
-              <w:t xml:space="preserve"> publicaci</w:t>
-            </w:r>
-            <w:r>
-              <w:rPr>
-                <w:rFonts w:ascii="Calibri" w:eastAsia="Calibri" w:hAnsi="Calibri" w:cs="Calibri"/>
-                <w:sz w:val="22"/>
-                <w:szCs w:val="22"/>
-              </w:rPr>
-              <w:t>ones disponibles a usuarios</w:t>
+              <w:t xml:space="preserve"> Listar las publicaciones disponibles a usuarios</w:t>
             </w:r>
           </w:p>
         </w:tc>
@@ -2903,6 +2668,9 @@
               <w:jc w:val="center"/>
             </w:pPr>
             <w:r>
+              <w:rPr>
+                <w:noProof/>
+              </w:rPr>
               <w:lastRenderedPageBreak/>
               <w:drawing>
                 <wp:inline distT="0" distB="0" distL="0" distR="0" wp14:anchorId="18CC0D74" wp14:editId="672CCBC4">
@@ -2946,6 +2714,9 @@
               <w:jc w:val="center"/>
             </w:pPr>
             <w:r>
+              <w:rPr>
+                <w:noProof/>
+              </w:rPr>
               <w:drawing>
                 <wp:inline distT="0" distB="0" distL="0" distR="0" wp14:anchorId="08189C27" wp14:editId="332B3745">
                   <wp:extent cx="6645910" cy="4255770"/>
@@ -3069,7 +2840,10 @@
               <w:t>página</w:t>
             </w:r>
             <w:r>
-              <w:t xml:space="preserve"> Home, se listan </w:t>
+              <w:t xml:space="preserve"> Post</w:t>
+            </w:r>
+            <w:r>
+              <w:t xml:space="preserve">, se listan </w:t>
             </w:r>
             <w:r>
               <w:t>automáticamente</w:t>
@@ -3131,7 +2905,13 @@
           </w:tcPr>
           <w:p>
             <w:r>
-              <w:t xml:space="preserve">Si no hay publicaciones en el sistema al acceder a la pantalla “HOME” el sistema </w:t>
+              <w:t xml:space="preserve">Si no hay publicaciones en el sistema al acceder a la pantalla </w:t>
+            </w:r>
+            <w:r>
+              <w:t>“Post</w:t>
+            </w:r>
+            <w:r>
+              <w:t xml:space="preserve">” el sistema </w:t>
             </w:r>
             <w:r>
               <w:t>mostrara</w:t>
@@ -3233,18 +3013,7 @@
                 <w:sz w:val="22"/>
                 <w:szCs w:val="22"/>
               </w:rPr>
-              <w:t>HU000</w:t>
-            </w:r>
-            <w:r>
-              <w:rPr>
-                <w:rFonts w:ascii="Calibri" w:eastAsia="Calibri" w:hAnsi="Calibri" w:cs="Calibri"/>
-                <w:b/>
-                <w:bCs/>
-                <w:color w:val="FFFFFF"/>
-                <w:sz w:val="22"/>
-                <w:szCs w:val="22"/>
-              </w:rPr>
-              <w:t>6</w:t>
+              <w:t>HU0006</w:t>
             </w:r>
             <w:r>
               <w:t xml:space="preserve"> </w:t>
@@ -3502,6 +3271,9 @@
               <w:jc w:val="center"/>
             </w:pPr>
             <w:r>
+              <w:rPr>
+                <w:noProof/>
+              </w:rPr>
               <w:drawing>
                 <wp:inline distT="0" distB="0" distL="0" distR="0" wp14:anchorId="0DD30C3F" wp14:editId="74897319">
                   <wp:extent cx="2019475" cy="2004234"/>
@@ -3544,6 +3316,9 @@
               <w:jc w:val="center"/>
             </w:pPr>
             <w:r>
+              <w:rPr>
+                <w:noProof/>
+              </w:rPr>
               <w:drawing>
                 <wp:inline distT="0" distB="0" distL="0" distR="0" wp14:anchorId="51D66DFB" wp14:editId="2A460A41">
                   <wp:extent cx="6645216" cy="4351397"/>
@@ -3720,6 +3495,7 @@
     <w:p/>
     <w:p>
       <w:pPr>
+        <w:jc w:val="center"/>
         <w:rPr>
           <w:b/>
           <w:bCs/>
@@ -3827,18 +3603,7 @@
                 <w:sz w:val="22"/>
                 <w:szCs w:val="22"/>
               </w:rPr>
-              <w:t>HU0</w:t>
-            </w:r>
-            <w:r>
-              <w:rPr>
-                <w:rFonts w:ascii="Calibri" w:eastAsia="Calibri" w:hAnsi="Calibri" w:cs="Calibri"/>
-                <w:b/>
-                <w:bCs/>
-                <w:color w:val="FFFFFF"/>
-                <w:sz w:val="22"/>
-                <w:szCs w:val="22"/>
-              </w:rPr>
-              <w:t xml:space="preserve">007 </w:t>
+              <w:t xml:space="preserve">HU0007 </w:t>
             </w:r>
             <w:r>
               <w:rPr>
@@ -4183,6 +3948,9 @@
               </mc:AlternateContent>
             </w:r>
             <w:r>
+              <w:rPr>
+                <w:noProof/>
+              </w:rPr>
               <w:drawing>
                 <wp:inline distT="0" distB="0" distL="0" distR="0" wp14:anchorId="6D22BC00" wp14:editId="68933D24">
                   <wp:extent cx="6645216" cy="4351397"/>
@@ -4225,6 +3993,9 @@
               <w:jc w:val="center"/>
             </w:pPr>
             <w:r>
+              <w:rPr>
+                <w:noProof/>
+              </w:rPr>
               <w:drawing>
                 <wp:inline distT="0" distB="0" distL="0" distR="0" wp14:anchorId="7DB503EB" wp14:editId="24644B47">
                   <wp:extent cx="4077053" cy="1120237"/>
@@ -4896,6 +4667,9 @@
               <w:jc w:val="center"/>
             </w:pPr>
             <w:r>
+              <w:rPr>
+                <w:noProof/>
+              </w:rPr>
               <w:drawing>
                 <wp:inline distT="0" distB="0" distL="0" distR="0" wp14:anchorId="58747850" wp14:editId="07386E4E">
                   <wp:extent cx="4191363" cy="967824"/>
@@ -5037,7 +4811,15 @@
             </w:r>
             <w:proofErr w:type="spellEnd"/>
             <w:r>
-              <w:t xml:space="preserve"> “Esta seguro de aprobar esta solicitud de compra”</w:t>
+              <w:t xml:space="preserve"> “</w:t>
+            </w:r>
+            <w:proofErr w:type="spellStart"/>
+            <w:r>
+              <w:t>Esta</w:t>
+            </w:r>
+            <w:proofErr w:type="spellEnd"/>
+            <w:r>
+              <w:t xml:space="preserve"> seguro de aprobar esta solicitud de compra”</w:t>
             </w:r>
           </w:p>
         </w:tc>
@@ -5625,6 +5407,9 @@
               <w:jc w:val="center"/>
             </w:pPr>
             <w:r>
+              <w:rPr>
+                <w:noProof/>
+              </w:rPr>
               <w:drawing>
                 <wp:inline distT="0" distB="0" distL="0" distR="0" wp14:anchorId="13C11813" wp14:editId="71C541C1">
                   <wp:extent cx="4244708" cy="1028789"/>
@@ -5934,29 +5719,7 @@
                 <w:sz w:val="22"/>
                 <w:szCs w:val="22"/>
               </w:rPr>
-              <w:t>HU00</w:t>
-            </w:r>
-            <w:r>
-              <w:rPr>
-                <w:rFonts w:ascii="Calibri" w:eastAsia="Calibri" w:hAnsi="Calibri" w:cs="Calibri"/>
-                <w:b/>
-                <w:bCs/>
-                <w:color w:val="FFFFFF"/>
-                <w:sz w:val="22"/>
-                <w:szCs w:val="22"/>
-              </w:rPr>
-              <w:t>10</w:t>
-            </w:r>
-            <w:r>
-              <w:rPr>
-                <w:rFonts w:ascii="Calibri" w:eastAsia="Calibri" w:hAnsi="Calibri" w:cs="Calibri"/>
-                <w:b/>
-                <w:bCs/>
-                <w:color w:val="FFFFFF"/>
-                <w:sz w:val="22"/>
-                <w:szCs w:val="22"/>
-              </w:rPr>
-              <w:t xml:space="preserve"> </w:t>
+              <w:t xml:space="preserve">HU0010 </w:t>
             </w:r>
             <w:r>
               <w:rPr>
@@ -6141,15 +5904,7 @@
                 <w:sz w:val="22"/>
                 <w:szCs w:val="22"/>
               </w:rPr>
-              <w:t xml:space="preserve"> </w:t>
-            </w:r>
-            <w:r>
-              <w:rPr>
-                <w:rFonts w:ascii="Calibri" w:eastAsia="Calibri" w:hAnsi="Calibri" w:cs="Calibri"/>
-                <w:sz w:val="22"/>
-                <w:szCs w:val="22"/>
-              </w:rPr>
-              <w:t>Lista</w:t>
+              <w:t xml:space="preserve"> Lista</w:t>
             </w:r>
             <w:r>
               <w:rPr>
@@ -6188,13 +5943,7 @@
               <w:rPr>
                 <w:rFonts w:ascii="Calibri" w:hAnsi="Calibri" w:cs="Calibri"/>
               </w:rPr>
-              <w:t xml:space="preserve">Como vendedor, necesito listar todas las solicitudes de compra, para poder llevar un control de </w:t>
-            </w:r>
-            <w:r>
-              <w:rPr>
-                <w:rFonts w:ascii="Calibri" w:hAnsi="Calibri" w:cs="Calibri"/>
-              </w:rPr>
-              <w:t>estas</w:t>
+              <w:t>Como vendedor, necesito listar todas las solicitudes de compra, para poder llevar un control de estas</w:t>
             </w:r>
           </w:p>
         </w:tc>
@@ -6280,6 +6029,9 @@
               <w:jc w:val="center"/>
             </w:pPr>
             <w:r>
+              <w:rPr>
+                <w:noProof/>
+              </w:rPr>
               <w:drawing>
                 <wp:inline distT="0" distB="0" distL="0" distR="0" wp14:anchorId="7CDA9879" wp14:editId="69185729">
                   <wp:extent cx="6645910" cy="4266565"/>
@@ -6635,18 +6387,7 @@
                 <w:sz w:val="22"/>
                 <w:szCs w:val="22"/>
               </w:rPr>
-              <w:t>1</w:t>
-            </w:r>
-            <w:r>
-              <w:rPr>
-                <w:rFonts w:ascii="Calibri" w:eastAsia="Calibri" w:hAnsi="Calibri" w:cs="Calibri"/>
-                <w:b/>
-                <w:bCs/>
-                <w:color w:val="FFFFFF"/>
-                <w:sz w:val="22"/>
-                <w:szCs w:val="22"/>
-              </w:rPr>
-              <w:t>1</w:t>
+              <w:t>11</w:t>
             </w:r>
           </w:p>
         </w:tc>
@@ -6826,6 +6567,9 @@
               <w:jc w:val="center"/>
             </w:pPr>
             <w:r>
+              <w:rPr>
+                <w:noProof/>
+              </w:rPr>
               <w:drawing>
                 <wp:inline distT="0" distB="0" distL="0" distR="0" wp14:anchorId="5EC244B7" wp14:editId="5DD2FDB1">
                   <wp:extent cx="6599492" cy="4313294"/>
@@ -6868,6 +6612,9 @@
               <w:jc w:val="center"/>
             </w:pPr>
             <w:r>
+              <w:rPr>
+                <w:noProof/>
+              </w:rPr>
               <w:lastRenderedPageBreak/>
               <w:drawing>
                 <wp:inline distT="0" distB="0" distL="0" distR="0" wp14:anchorId="23BA15D0" wp14:editId="34E38BA7">
@@ -7037,10 +6784,7 @@
           </w:tcPr>
           <w:p>
             <w:r>
-              <w:t>Al ingresar a la pantalla de solicitud de orden de compra</w:t>
-            </w:r>
-            <w:r>
-              <w:t xml:space="preserve"> y no hay solicitudes a pagar el sistema muestra un mensaje con “No hay solicitudes aprobadas”</w:t>
+              <w:t>Al ingresar a la pantalla de solicitud de orden de compra y no hay solicitudes a pagar el sistema muestra un mensaje con “No hay solicitudes aprobadas”</w:t>
             </w:r>
           </w:p>
         </w:tc>
@@ -7424,6 +7168,9 @@
               <w:jc w:val="center"/>
             </w:pPr>
             <w:r>
+              <w:rPr>
+                <w:noProof/>
+              </w:rPr>
               <w:drawing>
                 <wp:inline distT="0" distB="0" distL="0" distR="0" wp14:anchorId="060B6936" wp14:editId="7ECFFACE">
                   <wp:extent cx="3330229" cy="2270957"/>
@@ -7606,16 +7353,7 @@
           </w:tcPr>
           <w:p>
             <w:r>
-              <w:t>Al pagar se abre un modal y se presiona en método de pago “</w:t>
-            </w:r>
-            <w:r>
-              <w:t>PAGO EFECTIVO</w:t>
-            </w:r>
-            <w:r>
-              <w:t>”, entonces el sistema cargara</w:t>
-            </w:r>
-            <w:r>
-              <w:t xml:space="preserve"> la deuda al sistema</w:t>
+              <w:t>Al pagar se abre un modal y se presiona en método de pago “PAGO EFECTIVO”, entonces el sistema cargara la deuda al sistema</w:t>
             </w:r>
             <w:r>
               <w:t>, recibirá un comprobante al correo con mas detalle, y mostrara un mensaje “Pago efectuado correctamente”</w:t>

</xml_diff>